<commit_message>
Add protocol authoring, execution summary and evidence updates
- New protocol_generator.py backend module
- New ProtocolAuthoringModal and ExecutionSummaryModal frontend components
- Updates to agents, docx_writer, main, playwright_runner, schemas, coverage gate
- New uploaded protocols, executed reports and generated specs
- Ignore portable Node.js runtime; add .gitattributes for binary files

Co-Authored-By: Claude Opus 5.5 <noreply@anthropic.com>
</commit_message>
<xml_diff>
--- a/backend/artifacts/executed_CLIN-EU-PAT-OPV-1-1-PQ-022- Manual - Registering Adverse Event Case.docx
+++ b/backend/artifacts/executed_CLIN-EU-PAT-OPV-1-1-PQ-022- Manual - Registering Adverse Event Case.docx
@@ -9037,7 +9037,7 @@
                 <w:color w:val="475569"/>
                 <w:sz w:val="15"/>
               </w:rPr>
-              <w:t>Verified: System registered case successfully. Case ID TMP-CASE-7483 generated.</w:t>
+              <w:t>Verified: System registered case successfully. Case ID TMP-CASE-6802 generated.</w:t>
             </w:r>
           </w:p>
         </w:tc>
@@ -21874,1100 +21874,6 @@
           <w:szCs w:val="22"/>
         </w:rPr>
         <w:t>- End of Document -</w:t>
-      </w:r>
-    </w:p>
-    <w:p>
-      <w:r>
-        <w:br w:type="page"/>
-      </w:r>
-    </w:p>
-    <w:p>
-      <w:pPr>
-        <w:pStyle w:val="Heading1"/>
-        <w:spacing w:after="240"/>
-      </w:pPr>
-      <w:r>
-        <w:t>Execution Evidence Log (Captured Checkpoints)</w:t>
-      </w:r>
-    </w:p>
-    <w:p>
-      <w:pPr>
-        <w:spacing w:before="200"/>
-      </w:pPr>
-      <w:r>
-        <w:rPr>
-          <w:b/>
-          <w:sz w:val="20"/>
-        </w:rPr>
-        <w:t>[TS1-S01] Accessing into Clinevo OnePV Intake Production Environment.</w:t>
-        <w:br/>
-      </w:r>
-      <w:r>
-        <w:rPr>
-          <w:color w:val="475569"/>
-          <w:sz w:val="17"/>
-        </w:rPr>
-        <w:t>Result: Pass | Observed: Login page displayed successfully.</w:t>
-        <w:br/>
-      </w:r>
-    </w:p>
-    <w:p>
-      <w:pPr>
-        <w:jc w:val="center"/>
-      </w:pPr>
-      <w:r>
-        <w:drawing>
-          <wp:inline xmlns:a="http://schemas.openxmlformats.org/drawingml/2006/main" xmlns:pic="http://schemas.openxmlformats.org/drawingml/2006/picture">
-            <wp:extent cx="5029200" cy="2827544"/>
-            <wp:docPr id="2056098273" name="Picture 2056098273"/>
-            <wp:cNvGraphicFramePr>
-              <a:graphicFrameLocks noChangeAspect="1"/>
-            </wp:cNvGraphicFramePr>
-            <a:graphic>
-              <a:graphicData uri="http://schemas.openxmlformats.org/drawingml/2006/picture">
-                <pic:pic>
-                  <pic:nvPicPr>
-                    <pic:cNvPr id="0" name="TS1-S01.png"/>
-                    <pic:cNvPicPr/>
-                  </pic:nvPicPr>
-                  <pic:blipFill>
-                    <a:blip r:embed="rId21"/>
-                    <a:stretch>
-                      <a:fillRect/>
-                    </a:stretch>
-                  </pic:blipFill>
-                  <pic:spPr>
-                    <a:xfrm>
-                      <a:off x="0" y="0"/>
-                      <a:ext cx="5029200" cy="2827544"/>
-                    </a:xfrm>
-                    <a:prstGeom prst="rect"/>
-                  </pic:spPr>
-                </pic:pic>
-              </a:graphicData>
-            </a:graphic>
-          </wp:inline>
-        </w:drawing>
-      </w:r>
-    </w:p>
-    <w:p>
-      <w:pPr>
-        <w:spacing w:before="200"/>
-      </w:pPr>
-      <w:r>
-        <w:rPr>
-          <w:b/>
-          <w:sz w:val="20"/>
-        </w:rPr>
-        <w:t>[TS1-S02] Login to Clinevo OnePV system</w:t>
-        <w:br/>
-      </w:r>
-      <w:r>
-        <w:rPr>
-          <w:color w:val="475569"/>
-          <w:sz w:val="17"/>
-        </w:rPr>
-        <w:t>Result: Pass | Observed: Logged in as sirihari.banda. Header username and timestamp verified.</w:t>
-        <w:br/>
-      </w:r>
-    </w:p>
-    <w:p>
-      <w:pPr>
-        <w:jc w:val="center"/>
-      </w:pPr>
-      <w:r>
-        <w:drawing>
-          <wp:inline xmlns:a="http://schemas.openxmlformats.org/drawingml/2006/main" xmlns:pic="http://schemas.openxmlformats.org/drawingml/2006/picture">
-            <wp:extent cx="5029200" cy="2827544"/>
-            <wp:docPr id="2056098274" name="Picture 2056098274"/>
-            <wp:cNvGraphicFramePr>
-              <a:graphicFrameLocks noChangeAspect="1"/>
-            </wp:cNvGraphicFramePr>
-            <a:graphic>
-              <a:graphicData uri="http://schemas.openxmlformats.org/drawingml/2006/picture">
-                <pic:pic>
-                  <pic:nvPicPr>
-                    <pic:cNvPr id="0" name="TS1-S02.png"/>
-                    <pic:cNvPicPr/>
-                  </pic:nvPicPr>
-                  <pic:blipFill>
-                    <a:blip r:embed="rId22"/>
-                    <a:stretch>
-                      <a:fillRect/>
-                    </a:stretch>
-                  </pic:blipFill>
-                  <pic:spPr>
-                    <a:xfrm>
-                      <a:off x="0" y="0"/>
-                      <a:ext cx="5029200" cy="2827544"/>
-                    </a:xfrm>
-                    <a:prstGeom prst="rect"/>
-                  </pic:spPr>
-                </pic:pic>
-              </a:graphicData>
-            </a:graphic>
-          </wp:inline>
-        </w:drawing>
-      </w:r>
-    </w:p>
-    <w:p>
-      <w:pPr>
-        <w:spacing w:before="200"/>
-      </w:pPr>
-      <w:r>
-        <w:rPr>
-          <w:b/>
-          <w:sz w:val="20"/>
-        </w:rPr>
-        <w:t>[TS1-S03] System shall allow to navigate Manual Case Registration page.</w:t>
-        <w:br/>
-      </w:r>
-      <w:r>
-        <w:rPr>
-          <w:color w:val="475569"/>
-          <w:sz w:val="17"/>
-        </w:rPr>
-        <w:t>Result: Pass | Observed: Manual Case Registration form displayed with General Information and Intake sections.</w:t>
-        <w:br/>
-      </w:r>
-    </w:p>
-    <w:p>
-      <w:pPr>
-        <w:jc w:val="center"/>
-      </w:pPr>
-      <w:r>
-        <w:drawing>
-          <wp:inline xmlns:a="http://schemas.openxmlformats.org/drawingml/2006/main" xmlns:pic="http://schemas.openxmlformats.org/drawingml/2006/picture">
-            <wp:extent cx="5029200" cy="2827544"/>
-            <wp:docPr id="2056098275" name="Picture 2056098275"/>
-            <wp:cNvGraphicFramePr>
-              <a:graphicFrameLocks noChangeAspect="1"/>
-            </wp:cNvGraphicFramePr>
-            <a:graphic>
-              <a:graphicData uri="http://schemas.openxmlformats.org/drawingml/2006/picture">
-                <pic:pic>
-                  <pic:nvPicPr>
-                    <pic:cNvPr id="0" name="TS1-S02.png"/>
-                    <pic:cNvPicPr/>
-                  </pic:nvPicPr>
-                  <pic:blipFill>
-                    <a:blip r:embed="rId22"/>
-                    <a:stretch>
-                      <a:fillRect/>
-                    </a:stretch>
-                  </pic:blipFill>
-                  <pic:spPr>
-                    <a:xfrm>
-                      <a:off x="0" y="0"/>
-                      <a:ext cx="5029200" cy="2827544"/>
-                    </a:xfrm>
-                    <a:prstGeom prst="rect"/>
-                  </pic:spPr>
-                </pic:pic>
-              </a:graphicData>
-            </a:graphic>
-          </wp:inline>
-        </w:drawing>
-      </w:r>
-    </w:p>
-    <w:p>
-      <w:pPr>
-        <w:spacing w:before="200"/>
-      </w:pPr>
-      <w:r>
-        <w:rPr>
-          <w:b/>
-          <w:sz w:val="20"/>
-        </w:rPr>
-        <w:t>[TS1-S04] System shall allow to Register Case.</w:t>
-        <w:br/>
-      </w:r>
-      <w:r>
-        <w:rPr>
-          <w:color w:val="475569"/>
-          <w:sz w:val="17"/>
-        </w:rPr>
-        <w:t>Result: Pass | Observed: Verified: System registered case successfully. Case ID TMP-CASE-7483 generated.</w:t>
-        <w:br/>
-      </w:r>
-    </w:p>
-    <w:p>
-      <w:pPr>
-        <w:jc w:val="center"/>
-      </w:pPr>
-      <w:r>
-        <w:drawing>
-          <wp:inline xmlns:a="http://schemas.openxmlformats.org/drawingml/2006/main" xmlns:pic="http://schemas.openxmlformats.org/drawingml/2006/picture">
-            <wp:extent cx="5029200" cy="5655089"/>
-            <wp:docPr id="2056098276" name="Picture 2056098276"/>
-            <wp:cNvGraphicFramePr>
-              <a:graphicFrameLocks noChangeAspect="1"/>
-            </wp:cNvGraphicFramePr>
-            <a:graphic>
-              <a:graphicData uri="http://schemas.openxmlformats.org/drawingml/2006/picture">
-                <pic:pic>
-                  <pic:nvPicPr>
-                    <pic:cNvPr id="0" name="TS1-S04.png"/>
-                    <pic:cNvPicPr/>
-                  </pic:nvPicPr>
-                  <pic:blipFill>
-                    <a:blip r:embed="rId23"/>
-                    <a:stretch>
-                      <a:fillRect/>
-                    </a:stretch>
-                  </pic:blipFill>
-                  <pic:spPr>
-                    <a:xfrm>
-                      <a:off x="0" y="0"/>
-                      <a:ext cx="5029200" cy="5655089"/>
-                    </a:xfrm>
-                    <a:prstGeom prst="rect"/>
-                  </pic:spPr>
-                </pic:pic>
-              </a:graphicData>
-            </a:graphic>
-          </wp:inline>
-        </w:drawing>
-      </w:r>
-    </w:p>
-    <w:p>
-      <w:pPr>
-        <w:spacing w:before="200"/>
-      </w:pPr>
-      <w:r>
-        <w:rPr>
-          <w:b/>
-          <w:sz w:val="20"/>
-        </w:rPr>
-        <w:t>[TS1-S05] System shall allow to add Questionnaire manually.</w:t>
-        <w:br/>
-      </w:r>
-      <w:r>
-        <w:rPr>
-          <w:color w:val="475569"/>
-          <w:sz w:val="17"/>
-        </w:rPr>
-        <w:t>Result: Pass | Observed: Question added manually with confirmation message and displayed under Questionnaire tab.</w:t>
-        <w:br/>
-      </w:r>
-    </w:p>
-    <w:p>
-      <w:pPr>
-        <w:jc w:val="center"/>
-      </w:pPr>
-      <w:r>
-        <w:drawing>
-          <wp:inline xmlns:a="http://schemas.openxmlformats.org/drawingml/2006/main" xmlns:pic="http://schemas.openxmlformats.org/drawingml/2006/picture">
-            <wp:extent cx="5029200" cy="5655089"/>
-            <wp:docPr id="2056098277" name="Picture 2056098277"/>
-            <wp:cNvGraphicFramePr>
-              <a:graphicFrameLocks noChangeAspect="1"/>
-            </wp:cNvGraphicFramePr>
-            <a:graphic>
-              <a:graphicData uri="http://schemas.openxmlformats.org/drawingml/2006/picture">
-                <pic:pic>
-                  <pic:nvPicPr>
-                    <pic:cNvPr id="0" name="TS1-S05.png"/>
-                    <pic:cNvPicPr/>
-                  </pic:nvPicPr>
-                  <pic:blipFill>
-                    <a:blip r:embed="rId24"/>
-                    <a:stretch>
-                      <a:fillRect/>
-                    </a:stretch>
-                  </pic:blipFill>
-                  <pic:spPr>
-                    <a:xfrm>
-                      <a:off x="0" y="0"/>
-                      <a:ext cx="5029200" cy="5655089"/>
-                    </a:xfrm>
-                    <a:prstGeom prst="rect"/>
-                  </pic:spPr>
-                </pic:pic>
-              </a:graphicData>
-            </a:graphic>
-          </wp:inline>
-        </w:drawing>
-      </w:r>
-    </w:p>
-    <w:p>
-      <w:pPr>
-        <w:spacing w:before="200"/>
-      </w:pPr>
-      <w:r>
-        <w:rPr>
-          <w:b/>
-          <w:sz w:val="20"/>
-        </w:rPr>
-        <w:t>[TS1-S06] System shall allow to provide response for manually created question.</w:t>
-        <w:br/>
-      </w:r>
-      <w:r>
-        <w:rPr>
-          <w:color w:val="475569"/>
-          <w:sz w:val="17"/>
-        </w:rPr>
-        <w:t>Result: Pass | Observed: Questionnaire response entered and saved successfully with confirmation message.</w:t>
-        <w:br/>
-      </w:r>
-    </w:p>
-    <w:p>
-      <w:pPr>
-        <w:jc w:val="center"/>
-      </w:pPr>
-      <w:r>
-        <w:drawing>
-          <wp:inline xmlns:a="http://schemas.openxmlformats.org/drawingml/2006/main" xmlns:pic="http://schemas.openxmlformats.org/drawingml/2006/picture">
-            <wp:extent cx="5029200" cy="5655089"/>
-            <wp:docPr id="2056098278" name="Picture 2056098278"/>
-            <wp:cNvGraphicFramePr>
-              <a:graphicFrameLocks noChangeAspect="1"/>
-            </wp:cNvGraphicFramePr>
-            <a:graphic>
-              <a:graphicData uri="http://schemas.openxmlformats.org/drawingml/2006/picture">
-                <pic:pic>
-                  <pic:nvPicPr>
-                    <pic:cNvPr id="0" name="TS1-S06.png"/>
-                    <pic:cNvPicPr/>
-                  </pic:nvPicPr>
-                  <pic:blipFill>
-                    <a:blip r:embed="rId25"/>
-                    <a:stretch>
-                      <a:fillRect/>
-                    </a:stretch>
-                  </pic:blipFill>
-                  <pic:spPr>
-                    <a:xfrm>
-                      <a:off x="0" y="0"/>
-                      <a:ext cx="5029200" cy="5655089"/>
-                    </a:xfrm>
-                    <a:prstGeom prst="rect"/>
-                  </pic:spPr>
-                </pic:pic>
-              </a:graphicData>
-            </a:graphic>
-          </wp:inline>
-        </w:drawing>
-      </w:r>
-    </w:p>
-    <w:p>
-      <w:pPr>
-        <w:spacing w:before="200"/>
-      </w:pPr>
-      <w:r>
-        <w:rPr>
-          <w:b/>
-          <w:sz w:val="20"/>
-        </w:rPr>
-        <w:t>[TS1-S07] System shall allow to add Questionnaire from template.</w:t>
-        <w:br/>
-      </w:r>
-      <w:r>
-        <w:rPr>
-          <w:color w:val="475569"/>
-          <w:sz w:val="17"/>
-        </w:rPr>
-        <w:t>Result: Pass | Observed: FAQ Template dialog selected and displayed.</w:t>
-        <w:br/>
-      </w:r>
-    </w:p>
-    <w:p>
-      <w:pPr>
-        <w:jc w:val="center"/>
-      </w:pPr>
-      <w:r>
-        <w:drawing>
-          <wp:inline xmlns:a="http://schemas.openxmlformats.org/drawingml/2006/main" xmlns:pic="http://schemas.openxmlformats.org/drawingml/2006/picture">
-            <wp:extent cx="5029200" cy="2827544"/>
-            <wp:docPr id="2056098279" name="Picture 2056098279"/>
-            <wp:cNvGraphicFramePr>
-              <a:graphicFrameLocks noChangeAspect="1"/>
-            </wp:cNvGraphicFramePr>
-            <a:graphic>
-              <a:graphicData uri="http://schemas.openxmlformats.org/drawingml/2006/picture">
-                <pic:pic>
-                  <pic:nvPicPr>
-                    <pic:cNvPr id="0" name="TS1-S07.png"/>
-                    <pic:cNvPicPr/>
-                  </pic:nvPicPr>
-                  <pic:blipFill>
-                    <a:blip r:embed="rId26"/>
-                    <a:stretch>
-                      <a:fillRect/>
-                    </a:stretch>
-                  </pic:blipFill>
-                  <pic:spPr>
-                    <a:xfrm>
-                      <a:off x="0" y="0"/>
-                      <a:ext cx="5029200" cy="2827544"/>
-                    </a:xfrm>
-                    <a:prstGeom prst="rect"/>
-                  </pic:spPr>
-                </pic:pic>
-              </a:graphicData>
-            </a:graphic>
-          </wp:inline>
-        </w:drawing>
-      </w:r>
-    </w:p>
-    <w:p>
-      <w:pPr>
-        <w:spacing w:before="200"/>
-      </w:pPr>
-      <w:r>
-        <w:rPr>
-          <w:b/>
-          <w:sz w:val="20"/>
-        </w:rPr>
-        <w:t>[TS1-S08] System shall allow to provide response for created question from template under Questionnaire tab.</w:t>
-        <w:br/>
-      </w:r>
-      <w:r>
-        <w:rPr>
-          <w:color w:val="475569"/>
-          <w:sz w:val="17"/>
-        </w:rPr>
-        <w:t>Result: Pass | Observed: Template questionnaire response saved successfully.</w:t>
-        <w:br/>
-      </w:r>
-    </w:p>
-    <w:p>
-      <w:pPr>
-        <w:jc w:val="center"/>
-      </w:pPr>
-      <w:r>
-        <w:drawing>
-          <wp:inline xmlns:a="http://schemas.openxmlformats.org/drawingml/2006/main" xmlns:pic="http://schemas.openxmlformats.org/drawingml/2006/picture">
-            <wp:extent cx="5029200" cy="2827544"/>
-            <wp:docPr id="2056098280" name="Picture 2056098280"/>
-            <wp:cNvGraphicFramePr>
-              <a:graphicFrameLocks noChangeAspect="1"/>
-            </wp:cNvGraphicFramePr>
-            <a:graphic>
-              <a:graphicData uri="http://schemas.openxmlformats.org/drawingml/2006/picture">
-                <pic:pic>
-                  <pic:nvPicPr>
-                    <pic:cNvPr id="0" name="TS1-S08.png"/>
-                    <pic:cNvPicPr/>
-                  </pic:nvPicPr>
-                  <pic:blipFill>
-                    <a:blip r:embed="rId27"/>
-                    <a:stretch>
-                      <a:fillRect/>
-                    </a:stretch>
-                  </pic:blipFill>
-                  <pic:spPr>
-                    <a:xfrm>
-                      <a:off x="0" y="0"/>
-                      <a:ext cx="5029200" cy="2827544"/>
-                    </a:xfrm>
-                    <a:prstGeom prst="rect"/>
-                  </pic:spPr>
-                </pic:pic>
-              </a:graphicData>
-            </a:graphic>
-          </wp:inline>
-        </w:drawing>
-      </w:r>
-    </w:p>
-    <w:p>
-      <w:pPr>
-        <w:spacing w:before="200"/>
-      </w:pPr>
-      <w:r>
-        <w:rPr>
-          <w:b/>
-          <w:sz w:val="20"/>
-        </w:rPr>
-        <w:t>[TS1-S09] System shall allow to add reporter.</w:t>
-        <w:br/>
-      </w:r>
-      <w:r>
-        <w:rPr>
-          <w:color w:val="475569"/>
-          <w:sz w:val="17"/>
-        </w:rPr>
-        <w:t>Result: Pass | Observed: Reporter information (16/16 fields) saved successfully with confirmation message.</w:t>
-        <w:br/>
-      </w:r>
-    </w:p>
-    <w:p>
-      <w:pPr>
-        <w:jc w:val="center"/>
-      </w:pPr>
-      <w:r>
-        <w:drawing>
-          <wp:inline xmlns:a="http://schemas.openxmlformats.org/drawingml/2006/main" xmlns:pic="http://schemas.openxmlformats.org/drawingml/2006/picture">
-            <wp:extent cx="5029200" cy="5655089"/>
-            <wp:docPr id="2056098281" name="Picture 2056098281"/>
-            <wp:cNvGraphicFramePr>
-              <a:graphicFrameLocks noChangeAspect="1"/>
-            </wp:cNvGraphicFramePr>
-            <a:graphic>
-              <a:graphicData uri="http://schemas.openxmlformats.org/drawingml/2006/picture">
-                <pic:pic>
-                  <pic:nvPicPr>
-                    <pic:cNvPr id="0" name="TS1-S09.png"/>
-                    <pic:cNvPicPr/>
-                  </pic:nvPicPr>
-                  <pic:blipFill>
-                    <a:blip r:embed="rId28"/>
-                    <a:stretch>
-                      <a:fillRect/>
-                    </a:stretch>
-                  </pic:blipFill>
-                  <pic:spPr>
-                    <a:xfrm>
-                      <a:off x="0" y="0"/>
-                      <a:ext cx="5029200" cy="5655089"/>
-                    </a:xfrm>
-                    <a:prstGeom prst="rect"/>
-                  </pic:spPr>
-                </pic:pic>
-              </a:graphicData>
-            </a:graphic>
-          </wp:inline>
-        </w:drawing>
-      </w:r>
-    </w:p>
-    <w:p>
-      <w:pPr>
-        <w:spacing w:before="200"/>
-      </w:pPr>
-      <w:r>
-        <w:rPr>
-          <w:b/>
-          <w:sz w:val="20"/>
-        </w:rPr>
-        <w:t>[TS1-S10] System shall allow to Add Patient information.</w:t>
-        <w:br/>
-      </w:r>
-      <w:r>
-        <w:rPr>
-          <w:color w:val="475569"/>
-          <w:sz w:val="17"/>
-        </w:rPr>
-        <w:t>Result: Pass | Observed: Patient information (15/15 fields) saved successfully with confirmation message.</w:t>
-        <w:br/>
-      </w:r>
-    </w:p>
-    <w:p>
-      <w:pPr>
-        <w:jc w:val="center"/>
-      </w:pPr>
-      <w:r>
-        <w:drawing>
-          <wp:inline xmlns:a="http://schemas.openxmlformats.org/drawingml/2006/main" xmlns:pic="http://schemas.openxmlformats.org/drawingml/2006/picture">
-            <wp:extent cx="5029200" cy="5655089"/>
-            <wp:docPr id="2056098282" name="Picture 2056098282"/>
-            <wp:cNvGraphicFramePr>
-              <a:graphicFrameLocks noChangeAspect="1"/>
-            </wp:cNvGraphicFramePr>
-            <a:graphic>
-              <a:graphicData uri="http://schemas.openxmlformats.org/drawingml/2006/picture">
-                <pic:pic>
-                  <pic:nvPicPr>
-                    <pic:cNvPr id="0" name="TS1-S10.png"/>
-                    <pic:cNvPicPr/>
-                  </pic:nvPicPr>
-                  <pic:blipFill>
-                    <a:blip r:embed="rId29"/>
-                    <a:stretch>
-                      <a:fillRect/>
-                    </a:stretch>
-                  </pic:blipFill>
-                  <pic:spPr>
-                    <a:xfrm>
-                      <a:off x="0" y="0"/>
-                      <a:ext cx="5029200" cy="5655089"/>
-                    </a:xfrm>
-                    <a:prstGeom prst="rect"/>
-                  </pic:spPr>
-                </pic:pic>
-              </a:graphicData>
-            </a:graphic>
-          </wp:inline>
-        </w:drawing>
-      </w:r>
-    </w:p>
-    <w:p>
-      <w:pPr>
-        <w:spacing w:before="200"/>
-      </w:pPr>
-      <w:r>
-        <w:rPr>
-          <w:b/>
-          <w:sz w:val="20"/>
-        </w:rPr>
-        <w:t>[TS1-S11] System shall allow to Add product.</w:t>
-        <w:br/>
-      </w:r>
-      <w:r>
-        <w:rPr>
-          <w:color w:val="475569"/>
-          <w:sz w:val="17"/>
-        </w:rPr>
-        <w:t>Result: Pass | Observed: Product information added. Generic: 'Paracetamol', Formulation: 'TAB - Film-Coated Tablet' auto-populated.</w:t>
-        <w:br/>
-      </w:r>
-    </w:p>
-    <w:p>
-      <w:pPr>
-        <w:jc w:val="center"/>
-      </w:pPr>
-      <w:r>
-        <w:drawing>
-          <wp:inline xmlns:a="http://schemas.openxmlformats.org/drawingml/2006/main" xmlns:pic="http://schemas.openxmlformats.org/drawingml/2006/picture">
-            <wp:extent cx="5029200" cy="5655089"/>
-            <wp:docPr id="2056098283" name="Picture 2056098283"/>
-            <wp:cNvGraphicFramePr>
-              <a:graphicFrameLocks noChangeAspect="1"/>
-            </wp:cNvGraphicFramePr>
-            <a:graphic>
-              <a:graphicData uri="http://schemas.openxmlformats.org/drawingml/2006/picture">
-                <pic:pic>
-                  <pic:nvPicPr>
-                    <pic:cNvPr id="0" name="TS1-S11.png"/>
-                    <pic:cNvPicPr/>
-                  </pic:nvPicPr>
-                  <pic:blipFill>
-                    <a:blip r:embed="rId30"/>
-                    <a:stretch>
-                      <a:fillRect/>
-                    </a:stretch>
-                  </pic:blipFill>
-                  <pic:spPr>
-                    <a:xfrm>
-                      <a:off x="0" y="0"/>
-                      <a:ext cx="5029200" cy="5655089"/>
-                    </a:xfrm>
-                    <a:prstGeom prst="rect"/>
-                  </pic:spPr>
-                </pic:pic>
-              </a:graphicData>
-            </a:graphic>
-          </wp:inline>
-        </w:drawing>
-      </w:r>
-    </w:p>
-    <w:p>
-      <w:pPr>
-        <w:spacing w:before="200"/>
-      </w:pPr>
-      <w:r>
-        <w:rPr>
-          <w:b/>
-          <w:sz w:val="20"/>
-        </w:rPr>
-        <w:t>[TS1-S12] System shall allow to Add Event Information.</w:t>
-        <w:br/>
-      </w:r>
-      <w:r>
-        <w:rPr>
-          <w:color w:val="475569"/>
-          <w:sz w:val="17"/>
-        </w:rPr>
-        <w:t>Result: Pass | Observed: MedDRA code 10019211 displayed and Event saved (4 assessment &amp; 8 seriousness dropdowns verified).</w:t>
-        <w:br/>
-      </w:r>
-    </w:p>
-    <w:p>
-      <w:pPr>
-        <w:jc w:val="center"/>
-      </w:pPr>
-      <w:r>
-        <w:drawing>
-          <wp:inline xmlns:a="http://schemas.openxmlformats.org/drawingml/2006/main" xmlns:pic="http://schemas.openxmlformats.org/drawingml/2006/picture">
-            <wp:extent cx="5029200" cy="5655089"/>
-            <wp:docPr id="2056098284" name="Picture 2056098284"/>
-            <wp:cNvGraphicFramePr>
-              <a:graphicFrameLocks noChangeAspect="1"/>
-            </wp:cNvGraphicFramePr>
-            <a:graphic>
-              <a:graphicData uri="http://schemas.openxmlformats.org/drawingml/2006/picture">
-                <pic:pic>
-                  <pic:nvPicPr>
-                    <pic:cNvPr id="0" name="TS1-S12.png"/>
-                    <pic:cNvPicPr/>
-                  </pic:nvPicPr>
-                  <pic:blipFill>
-                    <a:blip r:embed="rId31"/>
-                    <a:stretch>
-                      <a:fillRect/>
-                    </a:stretch>
-                  </pic:blipFill>
-                  <pic:spPr>
-                    <a:xfrm>
-                      <a:off x="0" y="0"/>
-                      <a:ext cx="5029200" cy="5655089"/>
-                    </a:xfrm>
-                    <a:prstGeom prst="rect"/>
-                  </pic:spPr>
-                </pic:pic>
-              </a:graphicData>
-            </a:graphic>
-          </wp:inline>
-        </w:drawing>
-      </w:r>
-    </w:p>
-    <w:p>
-      <w:pPr>
-        <w:spacing w:before="200"/>
-      </w:pPr>
-      <w:r>
-        <w:rPr>
-          <w:b/>
-          <w:sz w:val="20"/>
-        </w:rPr>
-        <w:t>[TS1-S13] Verifying Reported Term’s Meddra Code.</w:t>
-        <w:br/>
-      </w:r>
-      <w:r>
-        <w:rPr>
-          <w:color w:val="475569"/>
-          <w:sz w:val="17"/>
-        </w:rPr>
-        <w:t>Result: Pass | Observed: MedDRA code verified under Event Information tab.</w:t>
-        <w:br/>
-      </w:r>
-    </w:p>
-    <w:p>
-      <w:pPr>
-        <w:jc w:val="center"/>
-      </w:pPr>
-      <w:r>
-        <w:drawing>
-          <wp:inline xmlns:a="http://schemas.openxmlformats.org/drawingml/2006/main" xmlns:pic="http://schemas.openxmlformats.org/drawingml/2006/picture">
-            <wp:extent cx="5029200" cy="2827544"/>
-            <wp:docPr id="2056098285" name="Picture 2056098285"/>
-            <wp:cNvGraphicFramePr>
-              <a:graphicFrameLocks noChangeAspect="1"/>
-            </wp:cNvGraphicFramePr>
-            <a:graphic>
-              <a:graphicData uri="http://schemas.openxmlformats.org/drawingml/2006/picture">
-                <pic:pic>
-                  <pic:nvPicPr>
-                    <pic:cNvPr id="0" name="TS1-S13.png"/>
-                    <pic:cNvPicPr/>
-                  </pic:nvPicPr>
-                  <pic:blipFill>
-                    <a:blip r:embed="rId32"/>
-                    <a:stretch>
-                      <a:fillRect/>
-                    </a:stretch>
-                  </pic:blipFill>
-                  <pic:spPr>
-                    <a:xfrm>
-                      <a:off x="0" y="0"/>
-                      <a:ext cx="5029200" cy="2827544"/>
-                    </a:xfrm>
-                    <a:prstGeom prst="rect"/>
-                  </pic:spPr>
-                </pic:pic>
-              </a:graphicData>
-            </a:graphic>
-          </wp:inline>
-        </w:drawing>
-      </w:r>
-    </w:p>
-    <w:p>
-      <w:pPr>
-        <w:spacing w:before="200"/>
-      </w:pPr>
-      <w:r>
-        <w:rPr>
-          <w:b/>
-          <w:sz w:val="20"/>
-        </w:rPr>
-        <w:t>[TS1-S14] System shall allow to add Log details.</w:t>
-        <w:br/>
-      </w:r>
-      <w:r>
-        <w:rPr>
-          <w:color w:val="475569"/>
-          <w:sz w:val="17"/>
-        </w:rPr>
-        <w:t>Result: Pass | Observed: Activity log added successfully with confirmation.</w:t>
-        <w:br/>
-      </w:r>
-    </w:p>
-    <w:p>
-      <w:pPr>
-        <w:jc w:val="center"/>
-      </w:pPr>
-      <w:r>
-        <w:drawing>
-          <wp:inline xmlns:a="http://schemas.openxmlformats.org/drawingml/2006/main" xmlns:pic="http://schemas.openxmlformats.org/drawingml/2006/picture">
-            <wp:extent cx="5029200" cy="2827544"/>
-            <wp:docPr id="2056098286" name="Picture 2056098286"/>
-            <wp:cNvGraphicFramePr>
-              <a:graphicFrameLocks noChangeAspect="1"/>
-            </wp:cNvGraphicFramePr>
-            <a:graphic>
-              <a:graphicData uri="http://schemas.openxmlformats.org/drawingml/2006/picture">
-                <pic:pic>
-                  <pic:nvPicPr>
-                    <pic:cNvPr id="0" name="TS1-S14.png"/>
-                    <pic:cNvPicPr/>
-                  </pic:nvPicPr>
-                  <pic:blipFill>
-                    <a:blip r:embed="rId33"/>
-                    <a:stretch>
-                      <a:fillRect/>
-                    </a:stretch>
-                  </pic:blipFill>
-                  <pic:spPr>
-                    <a:xfrm>
-                      <a:off x="0" y="0"/>
-                      <a:ext cx="5029200" cy="2827544"/>
-                    </a:xfrm>
-                    <a:prstGeom prst="rect"/>
-                  </pic:spPr>
-                </pic:pic>
-              </a:graphicData>
-            </a:graphic>
-          </wp:inline>
-        </w:drawing>
-      </w:r>
-    </w:p>
-    <w:p>
-      <w:pPr>
-        <w:spacing w:before="200"/>
-      </w:pPr>
-      <w:r>
-        <w:rPr>
-          <w:b/>
-          <w:sz w:val="20"/>
-        </w:rPr>
-        <w:t>[TS1-S15] System shall allow to Submit case.</w:t>
-        <w:br/>
-      </w:r>
-      <w:r>
-        <w:rPr>
-          <w:color w:val="475569"/>
-          <w:sz w:val="17"/>
-        </w:rPr>
-        <w:t>Result: Pass | Observed: Case submitted successfully. Official Case Number: CASE-2026-002 generated.</w:t>
-        <w:br/>
-      </w:r>
-    </w:p>
-    <w:p>
-      <w:pPr>
-        <w:jc w:val="center"/>
-      </w:pPr>
-      <w:r>
-        <w:drawing>
-          <wp:inline xmlns:a="http://schemas.openxmlformats.org/drawingml/2006/main" xmlns:pic="http://schemas.openxmlformats.org/drawingml/2006/picture">
-            <wp:extent cx="5029200" cy="2827544"/>
-            <wp:docPr id="2056098287" name="Picture 2056098287"/>
-            <wp:cNvGraphicFramePr>
-              <a:graphicFrameLocks noChangeAspect="1"/>
-            </wp:cNvGraphicFramePr>
-            <a:graphic>
-              <a:graphicData uri="http://schemas.openxmlformats.org/drawingml/2006/picture">
-                <pic:pic>
-                  <pic:nvPicPr>
-                    <pic:cNvPr id="0" name="TS1-S15.png"/>
-                    <pic:cNvPicPr/>
-                  </pic:nvPicPr>
-                  <pic:blipFill>
-                    <a:blip r:embed="rId34"/>
-                    <a:stretch>
-                      <a:fillRect/>
-                    </a:stretch>
-                  </pic:blipFill>
-                  <pic:spPr>
-                    <a:xfrm>
-                      <a:off x="0" y="0"/>
-                      <a:ext cx="5029200" cy="2827544"/>
-                    </a:xfrm>
-                    <a:prstGeom prst="rect"/>
-                  </pic:spPr>
-                </pic:pic>
-              </a:graphicData>
-            </a:graphic>
-          </wp:inline>
-        </w:drawing>
-      </w:r>
-    </w:p>
-    <w:p>
-      <w:pPr>
-        <w:spacing w:before="200"/>
-      </w:pPr>
-      <w:r>
-        <w:rPr>
-          <w:b/>
-          <w:sz w:val="20"/>
-        </w:rPr>
-        <w:t>[TS1-S16] Verifying Meddra Code of Event Information in Case Processing page.</w:t>
-        <w:br/>
-      </w:r>
-      <w:r>
-        <w:rPr>
-          <w:color w:val="475569"/>
-          <w:sz w:val="17"/>
-        </w:rPr>
-        <w:t>Result: Pass | Observed: MedDRA Code data verified in Case Processing page.</w:t>
-        <w:br/>
-      </w:r>
-    </w:p>
-    <w:p>
-      <w:pPr>
-        <w:jc w:val="center"/>
-      </w:pPr>
-      <w:r>
-        <w:drawing>
-          <wp:inline xmlns:a="http://schemas.openxmlformats.org/drawingml/2006/main" xmlns:pic="http://schemas.openxmlformats.org/drawingml/2006/picture">
-            <wp:extent cx="5029200" cy="2827544"/>
-            <wp:docPr id="2056098288" name="Picture 2056098288"/>
-            <wp:cNvGraphicFramePr>
-              <a:graphicFrameLocks noChangeAspect="1"/>
-            </wp:cNvGraphicFramePr>
-            <a:graphic>
-              <a:graphicData uri="http://schemas.openxmlformats.org/drawingml/2006/picture">
-                <pic:pic>
-                  <pic:nvPicPr>
-                    <pic:cNvPr id="0" name="TS1-S16.png"/>
-                    <pic:cNvPicPr/>
-                  </pic:nvPicPr>
-                  <pic:blipFill>
-                    <a:blip r:embed="rId35"/>
-                    <a:stretch>
-                      <a:fillRect/>
-                    </a:stretch>
-                  </pic:blipFill>
-                  <pic:spPr>
-                    <a:xfrm>
-                      <a:off x="0" y="0"/>
-                      <a:ext cx="5029200" cy="2827544"/>
-                    </a:xfrm>
-                    <a:prstGeom prst="rect"/>
-                  </pic:spPr>
-                </pic:pic>
-              </a:graphicData>
-            </a:graphic>
-          </wp:inline>
-        </w:drawing>
-      </w:r>
-    </w:p>
-    <w:p>
-      <w:pPr>
-        <w:spacing w:before="200"/>
-      </w:pPr>
-      <w:r>
-        <w:rPr>
-          <w:b/>
-          <w:sz w:val="20"/>
-        </w:rPr>
-        <w:t>[TS1-S17] System shall allow to Exit from the case processing.</w:t>
-        <w:br/>
-      </w:r>
-      <w:r>
-        <w:rPr>
-          <w:color w:val="475569"/>
-          <w:sz w:val="17"/>
-        </w:rPr>
-        <w:t>Result: Pass | Observed: User successfully exited from case to Case Intake Search.</w:t>
-        <w:br/>
-      </w:r>
-    </w:p>
-    <w:p>
-      <w:pPr>
-        <w:jc w:val="center"/>
-      </w:pPr>
-      <w:r>
-        <w:drawing>
-          <wp:inline xmlns:a="http://schemas.openxmlformats.org/drawingml/2006/main" xmlns:pic="http://schemas.openxmlformats.org/drawingml/2006/picture">
-            <wp:extent cx="5029200" cy="2827544"/>
-            <wp:docPr id="2056098289" name="Picture 2056098289"/>
-            <wp:cNvGraphicFramePr>
-              <a:graphicFrameLocks noChangeAspect="1"/>
-            </wp:cNvGraphicFramePr>
-            <a:graphic>
-              <a:graphicData uri="http://schemas.openxmlformats.org/drawingml/2006/picture">
-                <pic:pic>
-                  <pic:nvPicPr>
-                    <pic:cNvPr id="0" name="TS1-S17.png"/>
-                    <pic:cNvPicPr/>
-                  </pic:nvPicPr>
-                  <pic:blipFill>
-                    <a:blip r:embed="rId36"/>
-                    <a:stretch>
-                      <a:fillRect/>
-                    </a:stretch>
-                  </pic:blipFill>
-                  <pic:spPr>
-                    <a:xfrm>
-                      <a:off x="0" y="0"/>
-                      <a:ext cx="5029200" cy="2827544"/>
-                    </a:xfrm>
-                    <a:prstGeom prst="rect"/>
-                  </pic:spPr>
-                </pic:pic>
-              </a:graphicData>
-            </a:graphic>
-          </wp:inline>
-        </w:drawing>
-      </w:r>
-    </w:p>
-    <w:p>
-      <w:pPr>
-        <w:spacing w:before="200"/>
-      </w:pPr>
-      <w:r>
-        <w:rPr>
-          <w:b/>
-          <w:sz w:val="20"/>
-        </w:rPr>
-        <w:t>[TS1-S18] System shall allow to Logout.</w:t>
-        <w:br/>
-      </w:r>
-      <w:r>
-        <w:rPr>
-          <w:color w:val="475569"/>
-          <w:sz w:val="17"/>
-        </w:rPr>
-        <w:t>Result: Pass | Observed: User successfully logged out. Login page displayed.</w:t>
-        <w:br/>
-      </w:r>
-    </w:p>
-    <w:p>
-      <w:pPr>
-        <w:jc w:val="center"/>
-      </w:pPr>
-      <w:r>
-        <w:drawing>
-          <wp:inline xmlns:a="http://schemas.openxmlformats.org/drawingml/2006/main" xmlns:pic="http://schemas.openxmlformats.org/drawingml/2006/picture">
-            <wp:extent cx="5029200" cy="2827544"/>
-            <wp:docPr id="2056098290" name="Picture 2056098290"/>
-            <wp:cNvGraphicFramePr>
-              <a:graphicFrameLocks noChangeAspect="1"/>
-            </wp:cNvGraphicFramePr>
-            <a:graphic>
-              <a:graphicData uri="http://schemas.openxmlformats.org/drawingml/2006/picture">
-                <pic:pic>
-                  <pic:nvPicPr>
-                    <pic:cNvPr id="0" name="TS1-S18.png"/>
-                    <pic:cNvPicPr/>
-                  </pic:nvPicPr>
-                  <pic:blipFill>
-                    <a:blip r:embed="rId37"/>
-                    <a:stretch>
-                      <a:fillRect/>
-                    </a:stretch>
-                  </pic:blipFill>
-                  <pic:spPr>
-                    <a:xfrm>
-                      <a:off x="0" y="0"/>
-                      <a:ext cx="5029200" cy="2827544"/>
-                    </a:xfrm>
-                    <a:prstGeom prst="rect"/>
-                  </pic:spPr>
-                </pic:pic>
-              </a:graphicData>
-            </a:graphic>
-          </wp:inline>
-        </w:drawing>
       </w:r>
     </w:p>
     <w:sectPr>

</xml_diff>